<commit_message>
Praktikum dan Tugas Mandiri 10
</commit_message>
<xml_diff>
--- a/Pertemuan 10/Materi & Tugas/Hisyam Wildan Alfath_0110222206_LaporanPraktikumMandiri10.docx
+++ b/Pertemuan 10/Materi & Tugas/Hisyam Wildan Alfath_0110222206_LaporanPraktikumMandiri10.docx
@@ -1483,6 +1483,7 @@
       <w:r>
         <w:rPr>
           <w:rFonts w:ascii="Times New Roman" w:hAnsi="Times New Roman" w:cs="Times New Roman"/>
+          <w:noProof/>
           <w:sz w:val="24"/>
           <w:szCs w:val="24"/>
         </w:rPr>
@@ -2184,6 +2185,7 @@
       <w:r>
         <w:rPr>
           <w:rFonts w:ascii="Times New Roman" w:hAnsi="Times New Roman" w:cs="Times New Roman"/>
+          <w:noProof/>
           <w:sz w:val="24"/>
           <w:szCs w:val="24"/>
         </w:rPr>
@@ -2839,6 +2841,7 @@
       <w:r>
         <w:rPr>
           <w:rFonts w:ascii="Times New Roman" w:hAnsi="Times New Roman" w:cs="Times New Roman"/>
+          <w:noProof/>
           <w:sz w:val="24"/>
           <w:szCs w:val="24"/>
         </w:rPr>
@@ -3439,6 +3442,7 @@
       <w:r>
         <w:rPr>
           <w:rFonts w:ascii="Times New Roman" w:hAnsi="Times New Roman" w:cs="Times New Roman"/>
+          <w:noProof/>
           <w:sz w:val="24"/>
           <w:szCs w:val="24"/>
         </w:rPr>
@@ -4040,6 +4044,7 @@
       <w:r>
         <w:rPr>
           <w:rFonts w:ascii="Times New Roman" w:hAnsi="Times New Roman" w:cs="Times New Roman"/>
+          <w:noProof/>
           <w:sz w:val="24"/>
           <w:szCs w:val="24"/>
         </w:rPr>
@@ -4134,7 +4139,6 @@
         <w:t xml:space="preserve"> </w:t>
       </w:r>
       <w:proofErr w:type="spellStart"/>
-      <w:proofErr w:type="gramStart"/>
       <w:r>
         <w:rPr>
           <w:rFonts w:ascii="Times New Roman" w:hAnsi="Times New Roman" w:cs="Times New Roman"/>
@@ -4150,16 +4154,7 @@
           <w:sz w:val="24"/>
           <w:szCs w:val="24"/>
         </w:rPr>
-        <w:t>(</w:t>
-      </w:r>
-      <w:proofErr w:type="gramEnd"/>
-      <w:r>
-        <w:rPr>
-          <w:rFonts w:ascii="Times New Roman" w:hAnsi="Times New Roman" w:cs="Times New Roman"/>
-          <w:sz w:val="24"/>
-          <w:szCs w:val="24"/>
-        </w:rPr>
-        <w:t xml:space="preserve">) </w:t>
+        <w:t xml:space="preserve">() </w:t>
       </w:r>
       <w:proofErr w:type="spellStart"/>
       <w:r>
@@ -4714,6 +4709,7 @@
       <w:r>
         <w:rPr>
           <w:rFonts w:ascii="Times New Roman" w:hAnsi="Times New Roman" w:cs="Times New Roman"/>
+          <w:noProof/>
           <w:sz w:val="24"/>
           <w:szCs w:val="24"/>
         </w:rPr>
@@ -5412,6 +5408,7 @@
       <w:r>
         <w:rPr>
           <w:rFonts w:ascii="Times New Roman" w:hAnsi="Times New Roman" w:cs="Times New Roman"/>
+          <w:noProof/>
           <w:sz w:val="24"/>
           <w:szCs w:val="24"/>
         </w:rPr>
@@ -6060,6 +6057,7 @@
       <w:r>
         <w:rPr>
           <w:rFonts w:ascii="Times New Roman" w:hAnsi="Times New Roman" w:cs="Times New Roman"/>
+          <w:noProof/>
           <w:sz w:val="24"/>
           <w:szCs w:val="24"/>
         </w:rPr>
@@ -6563,6 +6561,7 @@
       <w:r>
         <w:rPr>
           <w:rFonts w:ascii="Times New Roman" w:hAnsi="Times New Roman" w:cs="Times New Roman"/>
+          <w:noProof/>
           <w:sz w:val="24"/>
           <w:szCs w:val="24"/>
         </w:rPr>
@@ -7121,6 +7120,7 @@
       <w:r>
         <w:rPr>
           <w:rFonts w:ascii="Times New Roman" w:hAnsi="Times New Roman" w:cs="Times New Roman"/>
+          <w:noProof/>
           <w:sz w:val="24"/>
           <w:szCs w:val="24"/>
         </w:rPr>
@@ -7651,6 +7651,7 @@
       <w:r>
         <w:rPr>
           <w:rFonts w:ascii="Times New Roman" w:hAnsi="Times New Roman" w:cs="Times New Roman"/>
+          <w:noProof/>
           <w:sz w:val="24"/>
           <w:szCs w:val="24"/>
         </w:rPr>
@@ -7743,16 +7744,7 @@
           <w:sz w:val="24"/>
           <w:szCs w:val="24"/>
         </w:rPr>
-        <w:t>confusion_</w:t>
-      </w:r>
-      <w:proofErr w:type="gramStart"/>
-      <w:r>
-        <w:rPr>
-          <w:rFonts w:ascii="Times New Roman" w:hAnsi="Times New Roman" w:cs="Times New Roman"/>
-          <w:sz w:val="24"/>
-          <w:szCs w:val="24"/>
-        </w:rPr>
-        <w:t>matrix</w:t>
+        <w:t>confusion_matrix</w:t>
       </w:r>
       <w:proofErr w:type="spellEnd"/>
       <w:r>
@@ -7764,7 +7756,6 @@
         <w:t>(</w:t>
       </w:r>
       <w:proofErr w:type="spellStart"/>
-      <w:proofErr w:type="gramEnd"/>
       <w:r>
         <w:rPr>
           <w:rFonts w:ascii="Times New Roman" w:hAnsi="Times New Roman" w:cs="Times New Roman"/>
@@ -7942,25 +7933,7 @@
           <w:sz w:val="24"/>
           <w:szCs w:val="24"/>
         </w:rPr>
-        <w:t xml:space="preserve"> [[4,1</w:t>
-      </w:r>
-      <w:proofErr w:type="gramStart"/>
-      <w:r>
-        <w:rPr>
-          <w:rFonts w:ascii="Times New Roman" w:hAnsi="Times New Roman" w:cs="Times New Roman"/>
-          <w:sz w:val="24"/>
-          <w:szCs w:val="24"/>
-        </w:rPr>
-        <w:t>],[</w:t>
-      </w:r>
-      <w:proofErr w:type="gramEnd"/>
-      <w:r>
-        <w:rPr>
-          <w:rFonts w:ascii="Times New Roman" w:hAnsi="Times New Roman" w:cs="Times New Roman"/>
-          <w:sz w:val="24"/>
-          <w:szCs w:val="24"/>
-        </w:rPr>
-        <w:t xml:space="preserve">2,3]] yang </w:t>
+        <w:t xml:space="preserve"> [[4,1],[2,3]] yang </w:t>
       </w:r>
       <w:proofErr w:type="spellStart"/>
       <w:r>
@@ -8119,6 +8092,7 @@
       <w:r>
         <w:rPr>
           <w:rFonts w:ascii="Times New Roman" w:hAnsi="Times New Roman" w:cs="Times New Roman"/>
+          <w:noProof/>
           <w:sz w:val="24"/>
           <w:szCs w:val="24"/>
         </w:rPr>
@@ -8605,6 +8579,7 @@
       <w:r>
         <w:rPr>
           <w:rFonts w:ascii="Times New Roman" w:hAnsi="Times New Roman" w:cs="Times New Roman"/>
+          <w:noProof/>
           <w:sz w:val="24"/>
           <w:szCs w:val="24"/>
         </w:rPr>
@@ -9012,27 +8987,7 @@
           <w:sz w:val="24"/>
           <w:szCs w:val="24"/>
         </w:rPr>
-        <w:t xml:space="preserve">Latihan 3 </w:t>
-      </w:r>
-      <w:r>
-        <w:rPr>
-          <w:rFonts w:ascii="Times New Roman" w:hAnsi="Times New Roman" w:cs="Times New Roman"/>
-          <w:b/>
-          <w:bCs/>
-          <w:sz w:val="24"/>
-          <w:szCs w:val="24"/>
-        </w:rPr>
-        <w:t>-</w:t>
-      </w:r>
-      <w:r>
-        <w:rPr>
-          <w:rFonts w:ascii="Times New Roman" w:hAnsi="Times New Roman" w:cs="Times New Roman"/>
-          <w:b/>
-          <w:bCs/>
-          <w:sz w:val="24"/>
-          <w:szCs w:val="24"/>
-        </w:rPr>
-        <w:t xml:space="preserve"> KNN Dataset </w:t>
+        <w:t xml:space="preserve">Latihan 3 - KNN Dataset </w:t>
       </w:r>
       <w:proofErr w:type="spellStart"/>
       <w:r>
@@ -9113,6 +9068,7 @@
       <w:r>
         <w:rPr>
           <w:rFonts w:ascii="Times New Roman" w:hAnsi="Times New Roman" w:cs="Times New Roman"/>
+          <w:noProof/>
           <w:sz w:val="24"/>
           <w:szCs w:val="24"/>
         </w:rPr>
@@ -9687,6 +9643,7 @@
       <w:r>
         <w:rPr>
           <w:rFonts w:ascii="Times New Roman" w:hAnsi="Times New Roman" w:cs="Times New Roman"/>
+          <w:noProof/>
           <w:sz w:val="24"/>
           <w:szCs w:val="24"/>
         </w:rPr>
@@ -9773,7 +9730,6 @@
         <w:t xml:space="preserve"> </w:t>
       </w:r>
       <w:proofErr w:type="spellStart"/>
-      <w:proofErr w:type="gramStart"/>
       <w:r>
         <w:rPr>
           <w:rFonts w:ascii="Times New Roman" w:hAnsi="Times New Roman" w:cs="Times New Roman"/>
@@ -9783,7 +9739,6 @@
         <w:t>drive.mount</w:t>
       </w:r>
       <w:proofErr w:type="spellEnd"/>
-      <w:proofErr w:type="gramEnd"/>
       <w:r>
         <w:rPr>
           <w:rFonts w:ascii="Times New Roman" w:hAnsi="Times New Roman" w:cs="Times New Roman"/>
@@ -10148,6 +10103,7 @@
       <w:r>
         <w:rPr>
           <w:rFonts w:ascii="Times New Roman" w:hAnsi="Times New Roman" w:cs="Times New Roman"/>
+          <w:noProof/>
           <w:sz w:val="24"/>
           <w:szCs w:val="24"/>
         </w:rPr>
@@ -10234,23 +10190,13 @@
         <w:t xml:space="preserve"> </w:t>
       </w:r>
       <w:proofErr w:type="spellStart"/>
-      <w:proofErr w:type="gramStart"/>
-      <w:r>
-        <w:rPr>
-          <w:rFonts w:ascii="Times New Roman" w:hAnsi="Times New Roman" w:cs="Times New Roman"/>
-          <w:sz w:val="24"/>
-          <w:szCs w:val="24"/>
-        </w:rPr>
-        <w:t>pd.read</w:t>
-      </w:r>
-      <w:proofErr w:type="gramEnd"/>
-      <w:r>
-        <w:rPr>
-          <w:rFonts w:ascii="Times New Roman" w:hAnsi="Times New Roman" w:cs="Times New Roman"/>
-          <w:sz w:val="24"/>
-          <w:szCs w:val="24"/>
-        </w:rPr>
-        <w:t>_csv</w:t>
+      <w:r>
+        <w:rPr>
+          <w:rFonts w:ascii="Times New Roman" w:hAnsi="Times New Roman" w:cs="Times New Roman"/>
+          <w:sz w:val="24"/>
+          <w:szCs w:val="24"/>
+        </w:rPr>
+        <w:t>pd.read_csv</w:t>
       </w:r>
       <w:proofErr w:type="spellEnd"/>
       <w:r>
@@ -10460,7 +10406,6 @@
         <w:t xml:space="preserve"> </w:t>
       </w:r>
       <w:proofErr w:type="spellStart"/>
-      <w:proofErr w:type="gramStart"/>
       <w:r>
         <w:rPr>
           <w:rFonts w:ascii="Times New Roman" w:hAnsi="Times New Roman" w:cs="Times New Roman"/>
@@ -10470,7 +10415,6 @@
         <w:t>df.head</w:t>
       </w:r>
       <w:proofErr w:type="spellEnd"/>
-      <w:proofErr w:type="gramEnd"/>
       <w:r>
         <w:rPr>
           <w:rFonts w:ascii="Times New Roman" w:hAnsi="Times New Roman" w:cs="Times New Roman"/>
@@ -11066,6 +11010,7 @@
       <w:r>
         <w:rPr>
           <w:rFonts w:ascii="Times New Roman" w:hAnsi="Times New Roman" w:cs="Times New Roman"/>
+          <w:noProof/>
           <w:sz w:val="24"/>
           <w:szCs w:val="24"/>
         </w:rPr>
@@ -11131,25 +11076,7 @@
           <w:sz w:val="24"/>
           <w:szCs w:val="24"/>
         </w:rPr>
-        <w:t xml:space="preserve">Kode </w:t>
-      </w:r>
-      <w:proofErr w:type="gramStart"/>
-      <w:r>
-        <w:rPr>
-          <w:rFonts w:ascii="Times New Roman" w:hAnsi="Times New Roman" w:cs="Times New Roman"/>
-          <w:sz w:val="24"/>
-          <w:szCs w:val="24"/>
-        </w:rPr>
-        <w:t>df.info(</w:t>
-      </w:r>
-      <w:proofErr w:type="gramEnd"/>
-      <w:r>
-        <w:rPr>
-          <w:rFonts w:ascii="Times New Roman" w:hAnsi="Times New Roman" w:cs="Times New Roman"/>
-          <w:sz w:val="24"/>
-          <w:szCs w:val="24"/>
-        </w:rPr>
-        <w:t xml:space="preserve">) </w:t>
+        <w:t xml:space="preserve">Kode df.info() </w:t>
       </w:r>
       <w:proofErr w:type="spellStart"/>
       <w:r>
@@ -11578,6 +11505,7 @@
       <w:r>
         <w:rPr>
           <w:rFonts w:ascii="Times New Roman" w:hAnsi="Times New Roman" w:cs="Times New Roman"/>
+          <w:noProof/>
           <w:sz w:val="24"/>
           <w:szCs w:val="24"/>
         </w:rPr>
@@ -11646,7 +11574,6 @@
         <w:t xml:space="preserve">Kode </w:t>
       </w:r>
       <w:proofErr w:type="spellStart"/>
-      <w:proofErr w:type="gramStart"/>
       <w:r>
         <w:rPr>
           <w:rFonts w:ascii="Times New Roman" w:hAnsi="Times New Roman" w:cs="Times New Roman"/>
@@ -11656,32 +11583,13 @@
         <w:t>df.isnull</w:t>
       </w:r>
       <w:proofErr w:type="spellEnd"/>
-      <w:proofErr w:type="gramEnd"/>
-      <w:r>
-        <w:rPr>
-          <w:rFonts w:ascii="Times New Roman" w:hAnsi="Times New Roman" w:cs="Times New Roman"/>
-          <w:sz w:val="24"/>
-          <w:szCs w:val="24"/>
-        </w:rPr>
-        <w:t>(</w:t>
-      </w:r>
-      <w:proofErr w:type="gramStart"/>
-      <w:r>
-        <w:rPr>
-          <w:rFonts w:ascii="Times New Roman" w:hAnsi="Times New Roman" w:cs="Times New Roman"/>
-          <w:sz w:val="24"/>
-          <w:szCs w:val="24"/>
-        </w:rPr>
-        <w:t>).sum</w:t>
-      </w:r>
-      <w:proofErr w:type="gramEnd"/>
-      <w:r>
-        <w:rPr>
-          <w:rFonts w:ascii="Times New Roman" w:hAnsi="Times New Roman" w:cs="Times New Roman"/>
-          <w:sz w:val="24"/>
-          <w:szCs w:val="24"/>
-        </w:rPr>
-        <w:t xml:space="preserve">() </w:t>
+      <w:r>
+        <w:rPr>
+          <w:rFonts w:ascii="Times New Roman" w:hAnsi="Times New Roman" w:cs="Times New Roman"/>
+          <w:sz w:val="24"/>
+          <w:szCs w:val="24"/>
+        </w:rPr>
+        <w:t xml:space="preserve">().sum() </w:t>
       </w:r>
       <w:proofErr w:type="spellStart"/>
       <w:r>
@@ -12110,6 +12018,7 @@
       <w:r>
         <w:rPr>
           <w:rFonts w:ascii="Times New Roman" w:hAnsi="Times New Roman" w:cs="Times New Roman"/>
+          <w:noProof/>
           <w:sz w:val="24"/>
           <w:szCs w:val="24"/>
         </w:rPr>
@@ -12977,7 +12886,6 @@
         <w:t xml:space="preserve"> lain di </w:t>
       </w:r>
       <w:proofErr w:type="spellStart"/>
-      <w:proofErr w:type="gramStart"/>
       <w:r>
         <w:rPr>
           <w:rFonts w:ascii="Times New Roman" w:hAnsi="Times New Roman" w:cs="Times New Roman"/>
@@ -12988,7 +12896,6 @@
         <w:t>X.columns</w:t>
       </w:r>
       <w:proofErr w:type="spellEnd"/>
-      <w:proofErr w:type="gramEnd"/>
       <w:r>
         <w:rPr>
           <w:rFonts w:ascii="Times New Roman" w:hAnsi="Times New Roman" w:cs="Times New Roman"/>
@@ -13614,6 +13521,7 @@
       <w:r>
         <w:rPr>
           <w:rFonts w:ascii="Times New Roman" w:hAnsi="Times New Roman" w:cs="Times New Roman"/>
+          <w:noProof/>
           <w:sz w:val="24"/>
           <w:szCs w:val="24"/>
         </w:rPr>
@@ -13934,7 +13842,6 @@
         <w:t xml:space="preserve"> </w:t>
       </w:r>
       <w:proofErr w:type="spellStart"/>
-      <w:proofErr w:type="gramStart"/>
       <w:r>
         <w:rPr>
           <w:rFonts w:ascii="Times New Roman" w:hAnsi="Times New Roman" w:cs="Times New Roman"/>
@@ -13950,16 +13857,7 @@
           <w:sz w:val="24"/>
           <w:szCs w:val="24"/>
         </w:rPr>
-        <w:t>(</w:t>
-      </w:r>
-      <w:proofErr w:type="gramEnd"/>
-      <w:r>
-        <w:rPr>
-          <w:rFonts w:ascii="Times New Roman" w:hAnsi="Times New Roman" w:cs="Times New Roman"/>
-          <w:sz w:val="24"/>
-          <w:szCs w:val="24"/>
-        </w:rPr>
-        <w:t xml:space="preserve">) </w:t>
+        <w:t xml:space="preserve">() </w:t>
       </w:r>
       <w:proofErr w:type="spellStart"/>
       <w:r>
@@ -14748,6 +14646,7 @@
       <w:r>
         <w:rPr>
           <w:rFonts w:ascii="Times New Roman" w:hAnsi="Times New Roman" w:cs="Times New Roman"/>
+          <w:noProof/>
           <w:sz w:val="24"/>
           <w:szCs w:val="24"/>
         </w:rPr>
@@ -14822,34 +14721,16 @@
           <w:sz w:val="24"/>
           <w:szCs w:val="24"/>
         </w:rPr>
-        <w:t>train_test_</w:t>
-      </w:r>
-      <w:proofErr w:type="gramStart"/>
-      <w:r>
-        <w:rPr>
-          <w:rFonts w:ascii="Times New Roman" w:hAnsi="Times New Roman" w:cs="Times New Roman"/>
-          <w:sz w:val="24"/>
-          <w:szCs w:val="24"/>
-        </w:rPr>
-        <w:t>split</w:t>
-      </w:r>
-      <w:proofErr w:type="spellEnd"/>
-      <w:r>
-        <w:rPr>
-          <w:rFonts w:ascii="Times New Roman" w:hAnsi="Times New Roman" w:cs="Times New Roman"/>
-          <w:sz w:val="24"/>
-          <w:szCs w:val="24"/>
-        </w:rPr>
-        <w:t>(</w:t>
-      </w:r>
-      <w:proofErr w:type="gramEnd"/>
-      <w:r>
-        <w:rPr>
-          <w:rFonts w:ascii="Times New Roman" w:hAnsi="Times New Roman" w:cs="Times New Roman"/>
-          <w:sz w:val="24"/>
-          <w:szCs w:val="24"/>
-        </w:rPr>
-        <w:t xml:space="preserve">X, y, </w:t>
+        <w:t>train_test_split</w:t>
+      </w:r>
+      <w:proofErr w:type="spellEnd"/>
+      <w:r>
+        <w:rPr>
+          <w:rFonts w:ascii="Times New Roman" w:hAnsi="Times New Roman" w:cs="Times New Roman"/>
+          <w:sz w:val="24"/>
+          <w:szCs w:val="24"/>
+        </w:rPr>
+        <w:t xml:space="preserve">(X, y, </w:t>
       </w:r>
       <w:proofErr w:type="spellStart"/>
       <w:r>
@@ -15224,6 +15105,7 @@
       <w:r>
         <w:rPr>
           <w:rFonts w:ascii="Times New Roman" w:hAnsi="Times New Roman" w:cs="Times New Roman"/>
+          <w:noProof/>
           <w:sz w:val="24"/>
           <w:szCs w:val="24"/>
         </w:rPr>
@@ -16230,6 +16112,7 @@
       <w:r>
         <w:rPr>
           <w:rFonts w:ascii="Times New Roman" w:hAnsi="Times New Roman" w:cs="Times New Roman"/>
+          <w:noProof/>
           <w:sz w:val="24"/>
           <w:szCs w:val="24"/>
         </w:rPr>
@@ -16316,7 +16199,6 @@
         <w:t xml:space="preserve"> </w:t>
       </w:r>
       <w:proofErr w:type="spellStart"/>
-      <w:proofErr w:type="gramStart"/>
       <w:r>
         <w:rPr>
           <w:rFonts w:ascii="Times New Roman" w:hAnsi="Times New Roman" w:cs="Times New Roman"/>
@@ -16335,7 +16217,6 @@
         <w:t>(</w:t>
       </w:r>
       <w:proofErr w:type="spellStart"/>
-      <w:proofErr w:type="gramEnd"/>
       <w:r>
         <w:rPr>
           <w:rFonts w:ascii="Times New Roman" w:hAnsi="Times New Roman" w:cs="Times New Roman"/>
@@ -16618,6 +16499,7 @@
       <w:r>
         <w:rPr>
           <w:rFonts w:ascii="Times New Roman" w:hAnsi="Times New Roman" w:cs="Times New Roman"/>
+          <w:noProof/>
           <w:sz w:val="24"/>
           <w:szCs w:val="24"/>
         </w:rPr>
@@ -16692,19 +16574,9 @@
           <w:sz w:val="24"/>
           <w:szCs w:val="24"/>
         </w:rPr>
-        <w:t>knn_</w:t>
-      </w:r>
-      <w:proofErr w:type="gramStart"/>
-      <w:r>
-        <w:rPr>
-          <w:rFonts w:ascii="Times New Roman" w:hAnsi="Times New Roman" w:cs="Times New Roman"/>
-          <w:sz w:val="24"/>
-          <w:szCs w:val="24"/>
-        </w:rPr>
-        <w:t>model.predict</w:t>
-      </w:r>
-      <w:proofErr w:type="spellEnd"/>
-      <w:proofErr w:type="gramEnd"/>
+        <w:t>knn_model.predict</w:t>
+      </w:r>
+      <w:proofErr w:type="spellEnd"/>
       <w:r>
         <w:rPr>
           <w:rFonts w:ascii="Times New Roman" w:hAnsi="Times New Roman" w:cs="Times New Roman"/>
@@ -17050,6 +16922,7 @@
       <w:r>
         <w:rPr>
           <w:rFonts w:ascii="Times New Roman" w:hAnsi="Times New Roman" w:cs="Times New Roman"/>
+          <w:noProof/>
           <w:sz w:val="24"/>
           <w:szCs w:val="24"/>
         </w:rPr>
@@ -17124,16 +16997,7 @@
           <w:sz w:val="24"/>
           <w:szCs w:val="24"/>
         </w:rPr>
-        <w:t>accuracy_</w:t>
-      </w:r>
-      <w:proofErr w:type="gramStart"/>
-      <w:r>
-        <w:rPr>
-          <w:rFonts w:ascii="Times New Roman" w:hAnsi="Times New Roman" w:cs="Times New Roman"/>
-          <w:sz w:val="24"/>
-          <w:szCs w:val="24"/>
-        </w:rPr>
-        <w:t>score</w:t>
+        <w:t>accuracy_score</w:t>
       </w:r>
       <w:proofErr w:type="spellEnd"/>
       <w:r>
@@ -17145,7 +17009,6 @@
         <w:t>(</w:t>
       </w:r>
       <w:proofErr w:type="spellStart"/>
-      <w:proofErr w:type="gramEnd"/>
       <w:r>
         <w:rPr>
           <w:rFonts w:ascii="Times New Roman" w:hAnsi="Times New Roman" w:cs="Times New Roman"/>
@@ -17428,6 +17291,7 @@
       <w:r>
         <w:rPr>
           <w:rFonts w:ascii="Times New Roman" w:hAnsi="Times New Roman" w:cs="Times New Roman"/>
+          <w:noProof/>
           <w:sz w:val="24"/>
           <w:szCs w:val="24"/>
         </w:rPr>
@@ -17502,16 +17366,7 @@
           <w:sz w:val="24"/>
           <w:szCs w:val="24"/>
         </w:rPr>
-        <w:t>classification_</w:t>
-      </w:r>
-      <w:proofErr w:type="gramStart"/>
-      <w:r>
-        <w:rPr>
-          <w:rFonts w:ascii="Times New Roman" w:hAnsi="Times New Roman" w:cs="Times New Roman"/>
-          <w:sz w:val="24"/>
-          <w:szCs w:val="24"/>
-        </w:rPr>
-        <w:t>report</w:t>
+        <w:t>classification_report</w:t>
       </w:r>
       <w:proofErr w:type="spellEnd"/>
       <w:r>
@@ -17523,7 +17378,6 @@
         <w:t>(</w:t>
       </w:r>
       <w:proofErr w:type="spellStart"/>
-      <w:proofErr w:type="gramEnd"/>
       <w:r>
         <w:rPr>
           <w:rFonts w:ascii="Times New Roman" w:hAnsi="Times New Roman" w:cs="Times New Roman"/>
@@ -17860,6 +17714,7 @@
       <w:r>
         <w:rPr>
           <w:rFonts w:ascii="Times New Roman" w:hAnsi="Times New Roman" w:cs="Times New Roman"/>
+          <w:noProof/>
           <w:sz w:val="24"/>
           <w:szCs w:val="24"/>
         </w:rPr>
@@ -17934,16 +17789,7 @@
           <w:sz w:val="24"/>
           <w:szCs w:val="24"/>
         </w:rPr>
-        <w:t>confusion_</w:t>
-      </w:r>
-      <w:proofErr w:type="gramStart"/>
-      <w:r>
-        <w:rPr>
-          <w:rFonts w:ascii="Times New Roman" w:hAnsi="Times New Roman" w:cs="Times New Roman"/>
-          <w:sz w:val="24"/>
-          <w:szCs w:val="24"/>
-        </w:rPr>
-        <w:t>matrix</w:t>
+        <w:t>confusion_matrix</w:t>
       </w:r>
       <w:proofErr w:type="spellEnd"/>
       <w:r>
@@ -17955,7 +17801,6 @@
         <w:t>(</w:t>
       </w:r>
       <w:proofErr w:type="spellStart"/>
-      <w:proofErr w:type="gramEnd"/>
       <w:r>
         <w:rPr>
           <w:rFonts w:ascii="Times New Roman" w:hAnsi="Times New Roman" w:cs="Times New Roman"/>
@@ -18310,6 +18155,7 @@
       <w:r>
         <w:rPr>
           <w:rFonts w:ascii="Times New Roman" w:hAnsi="Times New Roman" w:cs="Times New Roman"/>
+          <w:noProof/>
           <w:sz w:val="24"/>
           <w:szCs w:val="24"/>
         </w:rPr>
@@ -18967,7 +18813,7 @@
           <w:sz w:val="24"/>
           <w:szCs w:val="24"/>
         </w:rPr>
-        <w:t>для</w:t>
+        <w:t>untuk</w:t>
       </w:r>
       <w:proofErr w:type="spellEnd"/>
       <w:r>
@@ -19408,7 +19254,43 @@
           <w:sz w:val="24"/>
           <w:szCs w:val="24"/>
         </w:rPr>
-        <w:t xml:space="preserve">. Overall, KNN </w:t>
+        <w:t xml:space="preserve">. </w:t>
+      </w:r>
+      <w:proofErr w:type="spellStart"/>
+      <w:r>
+        <w:rPr>
+          <w:rFonts w:ascii="Times New Roman" w:hAnsi="Times New Roman" w:cs="Times New Roman"/>
+          <w:sz w:val="24"/>
+          <w:szCs w:val="24"/>
+        </w:rPr>
+        <w:t>Secara</w:t>
+      </w:r>
+      <w:proofErr w:type="spellEnd"/>
+      <w:r>
+        <w:rPr>
+          <w:rFonts w:ascii="Times New Roman" w:hAnsi="Times New Roman" w:cs="Times New Roman"/>
+          <w:sz w:val="24"/>
+          <w:szCs w:val="24"/>
+        </w:rPr>
+        <w:t xml:space="preserve"> </w:t>
+      </w:r>
+      <w:proofErr w:type="spellStart"/>
+      <w:r>
+        <w:rPr>
+          <w:rFonts w:ascii="Times New Roman" w:hAnsi="Times New Roman" w:cs="Times New Roman"/>
+          <w:sz w:val="24"/>
+          <w:szCs w:val="24"/>
+        </w:rPr>
+        <w:t>keseluruhan</w:t>
+      </w:r>
+      <w:proofErr w:type="spellEnd"/>
+      <w:r>
+        <w:rPr>
+          <w:rFonts w:ascii="Times New Roman" w:hAnsi="Times New Roman" w:cs="Times New Roman"/>
+          <w:sz w:val="24"/>
+          <w:szCs w:val="24"/>
+        </w:rPr>
+        <w:t xml:space="preserve">, KNN </w:t>
       </w:r>
       <w:proofErr w:type="spellStart"/>
       <w:r>
@@ -19678,7 +19560,7 @@
             <w:sz w:val="24"/>
             <w:szCs w:val="24"/>
           </w:rPr>
-          <w:t>https://github.com/HisyamWildan/TI03_HisyamW.A_0110222206/blob/main/Pertemuan%209/Praktikum%20dan%20Tugas%20Mandiri%2009/notebooks/praktikum09.ipynb</w:t>
+          <w:t>https://github.com/HisyamWildan/TI03_HisyamW.A_0110222206/blob/main/Pertemuan%2010/Praktikum%20dan%20Tugas%20Mandiri%2010/notebooks/praktikum10.ipynb</w:t>
         </w:r>
       </w:hyperlink>
     </w:p>
@@ -19690,8 +19572,8 @@
         <w:jc w:val="both"/>
         <w:rPr>
           <w:rFonts w:ascii="Times New Roman" w:hAnsi="Times New Roman" w:cs="Times New Roman"/>
-          <w:sz w:val="24"/>
-          <w:szCs w:val="24"/>
+          <w:sz w:val="28"/>
+          <w:szCs w:val="28"/>
         </w:rPr>
       </w:pPr>
     </w:p>
@@ -19780,7 +19662,7 @@
             <w:sz w:val="24"/>
             <w:szCs w:val="24"/>
           </w:rPr>
-          <w:t>https://github.com/HisyamWildan/TI03_HisyamW.A_0110222206/blob/main/Pertemuan%209/Praktikum%20dan%20Tugas%20Mandiri%2009/notebooks/latihan09.ipynb</w:t>
+          <w:t>https://github.com/HisyamWildan/TI03_HisyamW.A_0110222206/blob/main/Pertemuan%2010/Praktikum%20dan%20Tugas%20Mandiri%2010/notebooks/latihan10.ipynb</w:t>
         </w:r>
       </w:hyperlink>
     </w:p>
@@ -19792,8 +19674,8 @@
         <w:jc w:val="both"/>
         <w:rPr>
           <w:rFonts w:ascii="Times New Roman" w:hAnsi="Times New Roman" w:cs="Times New Roman"/>
-          <w:sz w:val="24"/>
-          <w:szCs w:val="24"/>
+          <w:sz w:val="28"/>
+          <w:szCs w:val="28"/>
         </w:rPr>
       </w:pPr>
     </w:p>
@@ -23142,44 +23024,10 @@
 </file>
 
 <file path=customXml/item1.xml><?xml version="1.0" encoding="utf-8"?>
-<?mso-contentType ?>
-<FormTemplates xmlns="http://schemas.microsoft.com/sharepoint/v3/contenttype/forms">
-  <Display>DocumentLibraryForm</Display>
-  <Edit>DocumentLibraryForm</Edit>
-  <New>DocumentLibraryForm</New>
-</FormTemplates>
+<b:Sources xmlns:b="http://schemas.openxmlformats.org/officeDocument/2006/bibliography" xmlns="http://schemas.openxmlformats.org/officeDocument/2006/bibliography" SelectedStyle="\APASixthEditionOfficeOnline.xsl" StyleName="APA" Version="6"/>
 </file>
 
 <file path=customXml/item2.xml><?xml version="1.0" encoding="utf-8"?>
-<p:properties xmlns:p="http://schemas.microsoft.com/office/2006/metadata/properties" xmlns:xsi="http://www.w3.org/2001/XMLSchema-instance" xmlns:pc="http://schemas.microsoft.com/office/infopath/2007/PartnerControls">
-  <documentManagement>
-    <lcf76f155ced4ddcb4097134ff3c332f xmlns="0d0ca077-4a5a-44b3-8225-e973392463e8">
-      <Terms xmlns="http://schemas.microsoft.com/office/infopath/2007/PartnerControls"/>
-    </lcf76f155ced4ddcb4097134ff3c332f>
-    <TaxCatchAll xmlns="cd0cb0cd-f387-4546-b6ee-941c869211de" xsi:nil="true"/>
-    <MediaLengthInSeconds xmlns="0d0ca077-4a5a-44b3-8225-e973392463e8" xsi:nil="true"/>
-    <SharedWithUsers xmlns="cd0cb0cd-f387-4546-b6ee-941c869211de">
-      <UserInfo>
-        <DisplayName>Chris Ingle</DisplayName>
-        <AccountId>15</AccountId>
-        <AccountType/>
-      </UserInfo>
-      <UserInfo>
-        <DisplayName>Rosalind Barrett</DisplayName>
-        <AccountId>41</AccountId>
-        <AccountType/>
-      </UserInfo>
-      <UserInfo>
-        <DisplayName>Caroline Fitzgerald</DisplayName>
-        <AccountId>25</AccountId>
-        <AccountType/>
-      </UserInfo>
-    </SharedWithUsers>
-  </documentManagement>
-</p:properties>
-</file>
-
-<file path=customXml/item3.xml><?xml version="1.0" encoding="utf-8"?>
 <ct:contentTypeSchema xmlns:ct="http://schemas.microsoft.com/office/2006/metadata/contentType" xmlns:ma="http://schemas.microsoft.com/office/2006/metadata/properties/metaAttributes" ct:_="" ma:_="" ma:contentTypeName="Document" ma:contentTypeID="0x01010032184C1F9DAC6447BDEA3721DE969FCB" ma:contentTypeVersion="18" ma:contentTypeDescription="Create a new document." ma:contentTypeScope="" ma:versionID="793b80367c14023430c193f947ce3f0e">
   <xsd:schema xmlns:xsd="http://www.w3.org/2001/XMLSchema" xmlns:xs="http://www.w3.org/2001/XMLSchema" xmlns:p="http://schemas.microsoft.com/office/2006/metadata/properties" xmlns:ns2="0d0ca077-4a5a-44b3-8225-e973392463e8" xmlns:ns3="cd0cb0cd-f387-4546-b6ee-941c869211de" targetNamespace="http://schemas.microsoft.com/office/2006/metadata/properties" ma:root="true" ma:fieldsID="304ec480d0c6d264986323110b7a94b1" ns2:_="" ns3:_="">
     <xsd:import namespace="0d0ca077-4a5a-44b3-8225-e973392463e8"/>
@@ -23434,30 +23282,53 @@
 </ct:contentTypeSchema>
 </file>
 
+<file path=customXml/item3.xml><?xml version="1.0" encoding="utf-8"?>
+<p:properties xmlns:p="http://schemas.microsoft.com/office/2006/metadata/properties" xmlns:xsi="http://www.w3.org/2001/XMLSchema-instance" xmlns:pc="http://schemas.microsoft.com/office/infopath/2007/PartnerControls">
+  <documentManagement>
+    <lcf76f155ced4ddcb4097134ff3c332f xmlns="0d0ca077-4a5a-44b3-8225-e973392463e8">
+      <Terms xmlns="http://schemas.microsoft.com/office/infopath/2007/PartnerControls"/>
+    </lcf76f155ced4ddcb4097134ff3c332f>
+    <TaxCatchAll xmlns="cd0cb0cd-f387-4546-b6ee-941c869211de" xsi:nil="true"/>
+    <MediaLengthInSeconds xmlns="0d0ca077-4a5a-44b3-8225-e973392463e8" xsi:nil="true"/>
+    <SharedWithUsers xmlns="cd0cb0cd-f387-4546-b6ee-941c869211de">
+      <UserInfo>
+        <DisplayName>Chris Ingle</DisplayName>
+        <AccountId>15</AccountId>
+        <AccountType/>
+      </UserInfo>
+      <UserInfo>
+        <DisplayName>Rosalind Barrett</DisplayName>
+        <AccountId>41</AccountId>
+        <AccountType/>
+      </UserInfo>
+      <UserInfo>
+        <DisplayName>Caroline Fitzgerald</DisplayName>
+        <AccountId>25</AccountId>
+        <AccountType/>
+      </UserInfo>
+    </SharedWithUsers>
+  </documentManagement>
+</p:properties>
+</file>
+
 <file path=customXml/item4.xml><?xml version="1.0" encoding="utf-8"?>
-<b:Sources xmlns:b="http://schemas.openxmlformats.org/officeDocument/2006/bibliography" xmlns="http://schemas.openxmlformats.org/officeDocument/2006/bibliography" SelectedStyle="\APASixthEditionOfficeOnline.xsl" StyleName="APA" Version="6"/>
+<?mso-contentType ?>
+<FormTemplates xmlns="http://schemas.microsoft.com/sharepoint/v3/contenttype/forms">
+  <Display>DocumentLibraryForm</Display>
+  <Edit>DocumentLibraryForm</Edit>
+  <New>DocumentLibraryForm</New>
+</FormTemplates>
 </file>
 
 <file path=customXml/itemProps1.xml><?xml version="1.0" encoding="utf-8"?>
-<ds:datastoreItem xmlns:ds="http://schemas.openxmlformats.org/officeDocument/2006/customXml" ds:itemID="{83A6A22A-9C14-46B9-AD3D-D6F73AC43EE6}">
+<ds:datastoreItem xmlns:ds="http://schemas.openxmlformats.org/officeDocument/2006/customXml" ds:itemID="{23BE1332-FFED-42EF-9329-B2D14A929D27}">
   <ds:schemaRefs>
-    <ds:schemaRef ds:uri="http://schemas.microsoft.com/sharepoint/v3/contenttype/forms"/>
+    <ds:schemaRef ds:uri="http://schemas.openxmlformats.org/officeDocument/2006/bibliography"/>
   </ds:schemaRefs>
 </ds:datastoreItem>
 </file>
 
 <file path=customXml/itemProps2.xml><?xml version="1.0" encoding="utf-8"?>
-<ds:datastoreItem xmlns:ds="http://schemas.openxmlformats.org/officeDocument/2006/customXml" ds:itemID="{D6C064DB-E98E-412C-AF48-DFED7351B3B6}">
-  <ds:schemaRefs>
-    <ds:schemaRef ds:uri="http://schemas.microsoft.com/office/2006/metadata/properties"/>
-    <ds:schemaRef ds:uri="http://schemas.microsoft.com/office/infopath/2007/PartnerControls"/>
-    <ds:schemaRef ds:uri="0d0ca077-4a5a-44b3-8225-e973392463e8"/>
-    <ds:schemaRef ds:uri="cd0cb0cd-f387-4546-b6ee-941c869211de"/>
-  </ds:schemaRefs>
-</ds:datastoreItem>
-</file>
-
-<file path=customXml/itemProps3.xml><?xml version="1.0" encoding="utf-8"?>
 <ds:datastoreItem xmlns:ds="http://schemas.openxmlformats.org/officeDocument/2006/customXml" ds:itemID="{858A8F9A-2B86-4366-B5C0-20C41A4411FA}">
   <ds:schemaRefs>
     <ds:schemaRef ds:uri="http://schemas.microsoft.com/office/2006/metadata/contentType"/>
@@ -23476,10 +23347,21 @@
 </ds:datastoreItem>
 </file>
 
+<file path=customXml/itemProps3.xml><?xml version="1.0" encoding="utf-8"?>
+<ds:datastoreItem xmlns:ds="http://schemas.openxmlformats.org/officeDocument/2006/customXml" ds:itemID="{D6C064DB-E98E-412C-AF48-DFED7351B3B6}">
+  <ds:schemaRefs>
+    <ds:schemaRef ds:uri="http://schemas.microsoft.com/office/2006/metadata/properties"/>
+    <ds:schemaRef ds:uri="http://schemas.microsoft.com/office/infopath/2007/PartnerControls"/>
+    <ds:schemaRef ds:uri="0d0ca077-4a5a-44b3-8225-e973392463e8"/>
+    <ds:schemaRef ds:uri="cd0cb0cd-f387-4546-b6ee-941c869211de"/>
+  </ds:schemaRefs>
+</ds:datastoreItem>
+</file>
+
 <file path=customXml/itemProps4.xml><?xml version="1.0" encoding="utf-8"?>
-<ds:datastoreItem xmlns:ds="http://schemas.openxmlformats.org/officeDocument/2006/customXml" ds:itemID="{23BE1332-FFED-42EF-9329-B2D14A929D27}">
+<ds:datastoreItem xmlns:ds="http://schemas.openxmlformats.org/officeDocument/2006/customXml" ds:itemID="{83A6A22A-9C14-46B9-AD3D-D6F73AC43EE6}">
   <ds:schemaRefs>
-    <ds:schemaRef ds:uri="http://schemas.openxmlformats.org/officeDocument/2006/bibliography"/>
+    <ds:schemaRef ds:uri="http://schemas.microsoft.com/sharepoint/v3/contenttype/forms"/>
   </ds:schemaRefs>
 </ds:datastoreItem>
 </file>
</xml_diff>